<commit_message>
Practice 5: Swagger API for Pot Store
</commit_message>
<xml_diff>
--- a/ФронтБэк_отчет_Челышев_5.docx
+++ b/ФронтБэк_отчет_Челышев_5.docx
@@ -5519,7 +5519,6 @@
           <w:bCs/>
           <w:sz w:val="32"/>
           <w:szCs w:val="32"/>
-          <w:lang w:val="en-US"/>
         </w:rPr>
       </w:pPr>
       <w:r>
@@ -5574,7 +5573,6 @@
           <w:bCs/>
           <w:sz w:val="32"/>
           <w:szCs w:val="32"/>
-          <w:lang w:val="en-US"/>
         </w:rPr>
       </w:pPr>
       <w:r>
@@ -5586,12 +5584,11 @@
           <w:szCs w:val="32"/>
           <w:lang w:val="en-US"/>
         </w:rPr>
-        <w:lastRenderedPageBreak/>
         <w:drawing>
-          <wp:inline distT="0" distB="0" distL="0" distR="0" wp14:anchorId="26DED325" wp14:editId="33831BE2">
-            <wp:extent cx="5940425" cy="6251575"/>
-            <wp:effectExtent l="0" t="0" r="3175" b="0"/>
-            <wp:docPr id="1929953829" name="Рисунок 1"/>
+          <wp:inline distT="0" distB="0" distL="0" distR="0" wp14:anchorId="67C4BD65" wp14:editId="0671F4B0">
+            <wp:extent cx="5940425" cy="3387725"/>
+            <wp:effectExtent l="0" t="0" r="3175" b="3175"/>
+            <wp:docPr id="1663746570" name="Рисунок 1"/>
             <wp:cNvGraphicFramePr>
               <a:graphicFrameLocks xmlns:a="http://schemas.openxmlformats.org/drawingml/2006/main" noChangeAspect="1"/>
             </wp:cNvGraphicFramePr>
@@ -5599,7 +5596,7 @@
               <a:graphicData uri="http://schemas.openxmlformats.org/drawingml/2006/picture">
                 <pic:pic xmlns:pic="http://schemas.openxmlformats.org/drawingml/2006/picture">
                   <pic:nvPicPr>
-                    <pic:cNvPr id="1929953829" name=""/>
+                    <pic:cNvPr id="1663746570" name=""/>
                     <pic:cNvPicPr/>
                   </pic:nvPicPr>
                   <pic:blipFill>
@@ -5611,7 +5608,7 @@
                   <pic:spPr>
                     <a:xfrm>
                       <a:off x="0" y="0"/>
-                      <a:ext cx="5940425" cy="6251575"/>
+                      <a:ext cx="5940425" cy="3387725"/>
                     </a:xfrm>
                     <a:prstGeom prst="rect">
                       <a:avLst/>
@@ -5633,7 +5630,6 @@
           <w:bCs/>
           <w:sz w:val="32"/>
           <w:szCs w:val="32"/>
-          <w:lang w:val="en-US"/>
         </w:rPr>
       </w:pPr>
       <w:r>
@@ -5643,14 +5639,13 @@
           <w:bCs/>
           <w:sz w:val="32"/>
           <w:szCs w:val="32"/>
-          <w:lang w:val="en-US"/>
         </w:rPr>
         <w:lastRenderedPageBreak/>
         <w:drawing>
-          <wp:inline distT="0" distB="0" distL="0" distR="0" wp14:anchorId="183B0E0E" wp14:editId="54BF274A">
-            <wp:extent cx="5940425" cy="6363335"/>
+          <wp:inline distT="0" distB="0" distL="0" distR="0" wp14:anchorId="41A2DF0E" wp14:editId="4505B1BD">
+            <wp:extent cx="5940425" cy="3304540"/>
             <wp:effectExtent l="0" t="0" r="3175" b="0"/>
-            <wp:docPr id="56930754" name="Рисунок 1"/>
+            <wp:docPr id="954356084" name="Рисунок 1"/>
             <wp:cNvGraphicFramePr>
               <a:graphicFrameLocks xmlns:a="http://schemas.openxmlformats.org/drawingml/2006/main" noChangeAspect="1"/>
             </wp:cNvGraphicFramePr>
@@ -5658,7 +5653,7 @@
               <a:graphicData uri="http://schemas.openxmlformats.org/drawingml/2006/picture">
                 <pic:pic xmlns:pic="http://schemas.openxmlformats.org/drawingml/2006/picture">
                   <pic:nvPicPr>
-                    <pic:cNvPr id="56930754" name=""/>
+                    <pic:cNvPr id="954356084" name=""/>
                     <pic:cNvPicPr/>
                   </pic:nvPicPr>
                   <pic:blipFill>
@@ -5670,7 +5665,7 @@
                   <pic:spPr>
                     <a:xfrm>
                       <a:off x="0" y="0"/>
-                      <a:ext cx="5940425" cy="6363335"/>
+                      <a:ext cx="5940425" cy="3304540"/>
                     </a:xfrm>
                     <a:prstGeom prst="rect">
                       <a:avLst/>
@@ -5704,12 +5699,11 @@
           <w:szCs w:val="32"/>
           <w:lang w:val="en-US"/>
         </w:rPr>
-        <w:lastRenderedPageBreak/>
         <w:drawing>
-          <wp:inline distT="0" distB="0" distL="0" distR="0" wp14:anchorId="084DAAEB" wp14:editId="680F5A74">
-            <wp:extent cx="5940425" cy="6871335"/>
-            <wp:effectExtent l="0" t="0" r="3175" b="5715"/>
-            <wp:docPr id="1683029879" name="Рисунок 1"/>
+          <wp:inline distT="0" distB="0" distL="0" distR="0" wp14:anchorId="3E2A4273" wp14:editId="61EC9031">
+            <wp:extent cx="5940425" cy="3388995"/>
+            <wp:effectExtent l="0" t="0" r="3175" b="1905"/>
+            <wp:docPr id="2128792999" name="Рисунок 1"/>
             <wp:cNvGraphicFramePr>
               <a:graphicFrameLocks xmlns:a="http://schemas.openxmlformats.org/drawingml/2006/main" noChangeAspect="1"/>
             </wp:cNvGraphicFramePr>
@@ -5717,7 +5711,7 @@
               <a:graphicData uri="http://schemas.openxmlformats.org/drawingml/2006/picture">
                 <pic:pic xmlns:pic="http://schemas.openxmlformats.org/drawingml/2006/picture">
                   <pic:nvPicPr>
-                    <pic:cNvPr id="1683029879" name=""/>
+                    <pic:cNvPr id="2128792999" name=""/>
                     <pic:cNvPicPr/>
                   </pic:nvPicPr>
                   <pic:blipFill>
@@ -5729,7 +5723,7 @@
                   <pic:spPr>
                     <a:xfrm>
                       <a:off x="0" y="0"/>
-                      <a:ext cx="5940425" cy="6871335"/>
+                      <a:ext cx="5940425" cy="3388995"/>
                     </a:xfrm>
                     <a:prstGeom prst="rect">
                       <a:avLst/>
@@ -5741,6 +5735,78 @@
           </wp:inline>
         </w:drawing>
       </w:r>
+    </w:p>
+    <w:p>
+      <w:pPr>
+        <w:jc w:val="center"/>
+        <w:rPr>
+          <w:rFonts w:ascii="Times New Roman" w:hAnsi="Times New Roman" w:cs="Times New Roman"/>
+          <w:b/>
+          <w:bCs/>
+          <w:sz w:val="32"/>
+          <w:szCs w:val="32"/>
+          <w:lang w:val="en-US"/>
+        </w:rPr>
+      </w:pPr>
+      <w:r>
+        <w:rPr>
+          <w:rFonts w:ascii="Times New Roman" w:hAnsi="Times New Roman" w:cs="Times New Roman"/>
+          <w:b/>
+          <w:bCs/>
+          <w:sz w:val="32"/>
+          <w:szCs w:val="32"/>
+          <w:lang w:val="en-US"/>
+        </w:rPr>
+        <w:lastRenderedPageBreak/>
+        <w:drawing>
+          <wp:inline distT="0" distB="0" distL="0" distR="0" wp14:anchorId="63FF7EE2" wp14:editId="5787618D">
+            <wp:extent cx="5940425" cy="3390900"/>
+            <wp:effectExtent l="0" t="0" r="3175" b="0"/>
+            <wp:docPr id="1581833422" name="Рисунок 1"/>
+            <wp:cNvGraphicFramePr>
+              <a:graphicFrameLocks xmlns:a="http://schemas.openxmlformats.org/drawingml/2006/main" noChangeAspect="1"/>
+            </wp:cNvGraphicFramePr>
+            <a:graphic xmlns:a="http://schemas.openxmlformats.org/drawingml/2006/main">
+              <a:graphicData uri="http://schemas.openxmlformats.org/drawingml/2006/picture">
+                <pic:pic xmlns:pic="http://schemas.openxmlformats.org/drawingml/2006/picture">
+                  <pic:nvPicPr>
+                    <pic:cNvPr id="1581833422" name=""/>
+                    <pic:cNvPicPr/>
+                  </pic:nvPicPr>
+                  <pic:blipFill>
+                    <a:blip r:embed="rId22"/>
+                    <a:stretch>
+                      <a:fillRect/>
+                    </a:stretch>
+                  </pic:blipFill>
+                  <pic:spPr>
+                    <a:xfrm>
+                      <a:off x="0" y="0"/>
+                      <a:ext cx="5940425" cy="3390900"/>
+                    </a:xfrm>
+                    <a:prstGeom prst="rect">
+                      <a:avLst/>
+                    </a:prstGeom>
+                  </pic:spPr>
+                </pic:pic>
+              </a:graphicData>
+            </a:graphic>
+          </wp:inline>
+        </w:drawing>
+      </w:r>
+    </w:p>
+    <w:p>
+      <w:pPr>
+        <w:jc w:val="center"/>
+        <w:rPr>
+          <w:rFonts w:ascii="Times New Roman" w:hAnsi="Times New Roman" w:cs="Times New Roman"/>
+          <w:b/>
+          <w:bCs/>
+          <w:sz w:val="32"/>
+          <w:szCs w:val="32"/>
+          <w:lang w:val="en-US"/>
+        </w:rPr>
+      </w:pPr>
     </w:p>
     <w:p>
       <w:pPr>

</xml_diff>